<commit_message>
Auto-save: 7 file(s) — 2026-10-23 12:27
</commit_message>
<xml_diff>
--- a/Notes/2026-10-23-xloop-ai-agents-page-content-v1.docx
+++ b/Notes/2026-10-23-xloop-ai-agents-page-content-v1.docx
@@ -3152,7 +3152,7 @@
           <w:sz w:val="18"/>
           <w:szCs w:val="18"/>
         </w:rPr>
-        <w:t xml:space="preserve">Link: the HBL Asset Management card below combines rule based automation and RPA.</w:t>
+        <w:t xml:space="preserve">Link: the asset management card below combines rule based automation and RPA.</w:t>
       </w:r>
     </w:p>
     <w:p>
@@ -4859,7 +4859,7 @@
                 <w:sz w:val="17"/>
                 <w:szCs w:val="17"/>
               </w:rPr>
-              <w:t xml:space="preserve">HBL Asset Management</w:t>
+              <w:t xml:space="preserve">One of the largest asset management companies in Pakistan</w:t>
             </w:r>
           </w:p>
         </w:tc>
@@ -4967,7 +4967,7 @@
           <w:sz w:val="18"/>
           <w:szCs w:val="18"/>
         </w:rPr>
-        <w:t xml:space="preserve">xServe card: same wording as the hub, plus the languages (Sana, 20 Oct). HBL card: approved claim A16 (live portfolio page); detail from Sana, 21 Oct; no figures. It is automation and RPA, not an LLM agent, and the card says so; it supports section 5.</w:t>
+        <w:t xml:space="preserve">xServe card: same wording as the hub, plus the languages (Sana, 20 Oct). Asset management card: detail from Sana, 21 Oct; anonymous per Sana's rule (23 Oct); no figures. It is automation and RPA, not an LLM agent, and the card says so; it supports section 5.</w:t>
       </w:r>
     </w:p>
     <w:p>
@@ -5458,7 +5458,7 @@
                 <w:sz w:val="19"/>
                 <w:szCs w:val="19"/>
               </w:rPr>
-              <w:t xml:space="preserve">xServe AI ordering agent · HBL Asset Management reconciliation automation</w:t>
+              <w:t xml:space="preserve">xServe AI ordering agent · fund reconciliation automation for a large asset manager</w:t>
             </w:r>
           </w:p>
         </w:tc>
@@ -5797,7 +5797,7 @@
           <w:sz w:val="21"/>
           <w:szCs w:val="21"/>
         </w:rPr>
-        <w:t xml:space="preserve">Yes. Agents connect through APIs, databases and connectors to systems such as Salesforce, SAP, Microsoft 365 and your own applications. Where a system has no API, RPA can enter the data, as we did for HBL Asset Management.</w:t>
+        <w:t xml:space="preserve">Yes. Agents connect through APIs, databases and connectors to systems such as Salesforce, SAP, Microsoft 365 and your own applications. Where a system has no API, RPA can enter the data, as we did for one of the largest asset management companies in Pakistan.</w:t>
       </w:r>
     </w:p>
     <w:p>

</xml_diff>